<commit_message>
Add GPS guide title pages and TOCs
</commit_message>
<xml_diff>
--- a/docs/GPS Time Sync Engineering Guide.docx
+++ b/docs/GPS Time Sync Engineering Guide.docx
@@ -42,11 +42,753 @@
     <w:p/>
     <w:p>
       <w:pPr>
+        <w:jc w:val="center"/>
+      </w:pPr>
+      <w:r>
+        <w:rPr>
+          <w:color w:val="595959"/>
+          <w:sz w:val="22"/>
+        </w:rPr>
+        <w:t>Last changed: July 17, 2026</w:t>
+      </w:r>
+    </w:p>
+    <w:p>
+      <w:r>
+        <w:br w:type="page"/>
+      </w:r>
+      <w:r>
+        <w:rPr>
+          <w:b/>
+          <w:color w:val="0C274C"/>
+          <w:sz w:val="40"/>
+        </w:rPr>
+        <w:lastRenderedPageBreak/>
+        <w:t>Table of Contents</w:t>
+      </w:r>
+    </w:p>
+    <w:p>
+      <w:pPr>
+        <w:pStyle w:val="TOC1"/>
+        <w:tabs>
+          <w:tab w:val="right" w:leader="dot" w:pos="9782"/>
+        </w:tabs>
+        <w:rPr>
+          <w:rFonts w:asciiTheme="minorHAnsi" w:hAnsiTheme="minorHAnsi"/>
+          <w:noProof/>
+          <w:kern w:val="2"/>
+          <w:sz w:val="24"/>
+          <w:szCs w:val="24"/>
+          <w14:ligatures w14:val="standardContextual"/>
+        </w:rPr>
+      </w:pPr>
+      <w:r>
+        <w:fldChar w:fldCharType="begin"/>
+      </w:r>
+      <w:r>
+        <w:instrText xml:space="preserve"> TOC \o "1-3" </w:instrText>
+      </w:r>
+      <w:r>
+        <w:fldChar w:fldCharType="separate"/>
+      </w:r>
+      <w:r>
+        <w:rPr>
+          <w:noProof/>
+        </w:rPr>
+        <w:t>Scope</w:t>
+      </w:r>
+      <w:r>
+        <w:rPr>
+          <w:noProof/>
+        </w:rPr>
+        <w:tab/>
+      </w:r>
+      <w:r>
+        <w:rPr>
+          <w:noProof/>
+        </w:rPr>
+        <w:fldChar w:fldCharType="begin"/>
+      </w:r>
+      <w:r>
+        <w:rPr>
+          <w:noProof/>
+        </w:rPr>
+        <w:instrText xml:space="preserve"> PAGEREF _Toc235183237 \h </w:instrText>
+      </w:r>
+      <w:r>
+        <w:rPr>
+          <w:noProof/>
+        </w:rPr>
+      </w:r>
+      <w:r>
+        <w:rPr>
+          <w:noProof/>
+        </w:rPr>
+        <w:fldChar w:fldCharType="separate"/>
+      </w:r>
+      <w:r>
+        <w:rPr>
+          <w:noProof/>
+        </w:rPr>
+        <w:t>3</w:t>
+      </w:r>
+      <w:r>
+        <w:rPr>
+          <w:noProof/>
+        </w:rPr>
+        <w:fldChar w:fldCharType="end"/>
+      </w:r>
+    </w:p>
+    <w:p>
+      <w:pPr>
+        <w:pStyle w:val="TOC1"/>
+        <w:tabs>
+          <w:tab w:val="right" w:leader="dot" w:pos="9782"/>
+        </w:tabs>
+        <w:rPr>
+          <w:rFonts w:asciiTheme="minorHAnsi" w:hAnsiTheme="minorHAnsi"/>
+          <w:noProof/>
+          <w:kern w:val="2"/>
+          <w:sz w:val="24"/>
+          <w:szCs w:val="24"/>
+          <w14:ligatures w14:val="standardContextual"/>
+        </w:rPr>
+      </w:pPr>
+      <w:r>
+        <w:rPr>
+          <w:noProof/>
+        </w:rPr>
+        <w:t>Project Structure</w:t>
+      </w:r>
+      <w:r>
+        <w:rPr>
+          <w:noProof/>
+        </w:rPr>
+        <w:tab/>
+      </w:r>
+      <w:r>
+        <w:rPr>
+          <w:noProof/>
+        </w:rPr>
+        <w:fldChar w:fldCharType="begin"/>
+      </w:r>
+      <w:r>
+        <w:rPr>
+          <w:noProof/>
+        </w:rPr>
+        <w:instrText xml:space="preserve"> PAGEREF _Toc235183238 \h </w:instrText>
+      </w:r>
+      <w:r>
+        <w:rPr>
+          <w:noProof/>
+        </w:rPr>
+      </w:r>
+      <w:r>
+        <w:rPr>
+          <w:noProof/>
+        </w:rPr>
+        <w:fldChar w:fldCharType="separate"/>
+      </w:r>
+      <w:r>
+        <w:rPr>
+          <w:noProof/>
+        </w:rPr>
+        <w:t>3</w:t>
+      </w:r>
+      <w:r>
+        <w:rPr>
+          <w:noProof/>
+        </w:rPr>
+        <w:fldChar w:fldCharType="end"/>
+      </w:r>
+    </w:p>
+    <w:p>
+      <w:pPr>
+        <w:pStyle w:val="TOC1"/>
+        <w:tabs>
+          <w:tab w:val="right" w:leader="dot" w:pos="9782"/>
+        </w:tabs>
+        <w:rPr>
+          <w:rFonts w:asciiTheme="minorHAnsi" w:hAnsiTheme="minorHAnsi"/>
+          <w:noProof/>
+          <w:kern w:val="2"/>
+          <w:sz w:val="24"/>
+          <w:szCs w:val="24"/>
+          <w14:ligatures w14:val="standardContextual"/>
+        </w:rPr>
+      </w:pPr>
+      <w:r>
+        <w:rPr>
+          <w:noProof/>
+        </w:rPr>
+        <w:t>Runtime Startup</w:t>
+      </w:r>
+      <w:r>
+        <w:rPr>
+          <w:noProof/>
+        </w:rPr>
+        <w:tab/>
+      </w:r>
+      <w:r>
+        <w:rPr>
+          <w:noProof/>
+        </w:rPr>
+        <w:fldChar w:fldCharType="begin"/>
+      </w:r>
+      <w:r>
+        <w:rPr>
+          <w:noProof/>
+        </w:rPr>
+        <w:instrText xml:space="preserve"> PAGEREF _Toc235183239 \h </w:instrText>
+      </w:r>
+      <w:r>
+        <w:rPr>
+          <w:noProof/>
+        </w:rPr>
+      </w:r>
+      <w:r>
+        <w:rPr>
+          <w:noProof/>
+        </w:rPr>
+        <w:fldChar w:fldCharType="separate"/>
+      </w:r>
+      <w:r>
+        <w:rPr>
+          <w:noProof/>
+        </w:rPr>
+        <w:t>3</w:t>
+      </w:r>
+      <w:r>
+        <w:rPr>
+          <w:noProof/>
+        </w:rPr>
+        <w:fldChar w:fldCharType="end"/>
+      </w:r>
+    </w:p>
+    <w:p>
+      <w:pPr>
+        <w:pStyle w:val="TOC1"/>
+        <w:tabs>
+          <w:tab w:val="right" w:leader="dot" w:pos="9782"/>
+        </w:tabs>
+        <w:rPr>
+          <w:rFonts w:asciiTheme="minorHAnsi" w:hAnsiTheme="minorHAnsi"/>
+          <w:noProof/>
+          <w:kern w:val="2"/>
+          <w:sz w:val="24"/>
+          <w:szCs w:val="24"/>
+          <w14:ligatures w14:val="standardContextual"/>
+        </w:rPr>
+      </w:pPr>
+      <w:r>
+        <w:rPr>
+          <w:noProof/>
+        </w:rPr>
+        <w:t>Main Form Components</w:t>
+      </w:r>
+      <w:r>
+        <w:rPr>
+          <w:noProof/>
+        </w:rPr>
+        <w:tab/>
+      </w:r>
+      <w:r>
+        <w:rPr>
+          <w:noProof/>
+        </w:rPr>
+        <w:fldChar w:fldCharType="begin"/>
+      </w:r>
+      <w:r>
+        <w:rPr>
+          <w:noProof/>
+        </w:rPr>
+        <w:instrText xml:space="preserve"> PAGEREF _Toc235183240 \h </w:instrText>
+      </w:r>
+      <w:r>
+        <w:rPr>
+          <w:noProof/>
+        </w:rPr>
+      </w:r>
+      <w:r>
+        <w:rPr>
+          <w:noProof/>
+        </w:rPr>
+        <w:fldChar w:fldCharType="separate"/>
+      </w:r>
+      <w:r>
+        <w:rPr>
+          <w:noProof/>
+        </w:rPr>
+        <w:t>3</w:t>
+      </w:r>
+      <w:r>
+        <w:rPr>
+          <w:noProof/>
+        </w:rPr>
+        <w:fldChar w:fldCharType="end"/>
+      </w:r>
+    </w:p>
+    <w:p>
+      <w:pPr>
+        <w:pStyle w:val="TOC1"/>
+        <w:tabs>
+          <w:tab w:val="right" w:leader="dot" w:pos="9782"/>
+        </w:tabs>
+        <w:rPr>
+          <w:rFonts w:asciiTheme="minorHAnsi" w:hAnsiTheme="minorHAnsi"/>
+          <w:noProof/>
+          <w:kern w:val="2"/>
+          <w:sz w:val="24"/>
+          <w:szCs w:val="24"/>
+          <w14:ligatures w14:val="standardContextual"/>
+        </w:rPr>
+      </w:pPr>
+      <w:r>
+        <w:rPr>
+          <w:noProof/>
+        </w:rPr>
+        <w:t>Serial Port and VK-172 Detection</w:t>
+      </w:r>
+      <w:r>
+        <w:rPr>
+          <w:noProof/>
+        </w:rPr>
+        <w:tab/>
+      </w:r>
+      <w:r>
+        <w:rPr>
+          <w:noProof/>
+        </w:rPr>
+        <w:fldChar w:fldCharType="begin"/>
+      </w:r>
+      <w:r>
+        <w:rPr>
+          <w:noProof/>
+        </w:rPr>
+        <w:instrText xml:space="preserve"> PAGEREF _Toc235183241 \h </w:instrText>
+      </w:r>
+      <w:r>
+        <w:rPr>
+          <w:noProof/>
+        </w:rPr>
+      </w:r>
+      <w:r>
+        <w:rPr>
+          <w:noProof/>
+        </w:rPr>
+        <w:fldChar w:fldCharType="separate"/>
+      </w:r>
+      <w:r>
+        <w:rPr>
+          <w:noProof/>
+        </w:rPr>
+        <w:t>4</w:t>
+      </w:r>
+      <w:r>
+        <w:rPr>
+          <w:noProof/>
+        </w:rPr>
+        <w:fldChar w:fldCharType="end"/>
+      </w:r>
+    </w:p>
+    <w:p>
+      <w:pPr>
+        <w:pStyle w:val="TOC1"/>
+        <w:tabs>
+          <w:tab w:val="right" w:leader="dot" w:pos="9782"/>
+        </w:tabs>
+        <w:rPr>
+          <w:rFonts w:asciiTheme="minorHAnsi" w:hAnsiTheme="minorHAnsi"/>
+          <w:noProof/>
+          <w:kern w:val="2"/>
+          <w:sz w:val="24"/>
+          <w:szCs w:val="24"/>
+          <w14:ligatures w14:val="standardContextual"/>
+        </w:rPr>
+      </w:pPr>
+      <w:r>
+        <w:rPr>
+          <w:noProof/>
+        </w:rPr>
+        <w:t>NMEA Processing</w:t>
+      </w:r>
+      <w:r>
+        <w:rPr>
+          <w:noProof/>
+        </w:rPr>
+        <w:tab/>
+      </w:r>
+      <w:r>
+        <w:rPr>
+          <w:noProof/>
+        </w:rPr>
+        <w:fldChar w:fldCharType="begin"/>
+      </w:r>
+      <w:r>
+        <w:rPr>
+          <w:noProof/>
+        </w:rPr>
+        <w:instrText xml:space="preserve"> PAGEREF _Toc235183242 \h </w:instrText>
+      </w:r>
+      <w:r>
+        <w:rPr>
+          <w:noProof/>
+        </w:rPr>
+      </w:r>
+      <w:r>
+        <w:rPr>
+          <w:noProof/>
+        </w:rPr>
+        <w:fldChar w:fldCharType="separate"/>
+      </w:r>
+      <w:r>
+        <w:rPr>
+          <w:noProof/>
+        </w:rPr>
+        <w:t>4</w:t>
+      </w:r>
+      <w:r>
+        <w:rPr>
+          <w:noProof/>
+        </w:rPr>
+        <w:fldChar w:fldCharType="end"/>
+      </w:r>
+    </w:p>
+    <w:p>
+      <w:pPr>
+        <w:pStyle w:val="TOC1"/>
+        <w:tabs>
+          <w:tab w:val="right" w:leader="dot" w:pos="9782"/>
+        </w:tabs>
+        <w:rPr>
+          <w:rFonts w:asciiTheme="minorHAnsi" w:hAnsiTheme="minorHAnsi"/>
+          <w:noProof/>
+          <w:kern w:val="2"/>
+          <w:sz w:val="24"/>
+          <w:szCs w:val="24"/>
+          <w14:ligatures w14:val="standardContextual"/>
+        </w:rPr>
+      </w:pPr>
+      <w:r>
+        <w:rPr>
+          <w:noProof/>
+        </w:rPr>
+        <w:t>Clock Synchronization</w:t>
+      </w:r>
+      <w:r>
+        <w:rPr>
+          <w:noProof/>
+        </w:rPr>
+        <w:tab/>
+      </w:r>
+      <w:r>
+        <w:rPr>
+          <w:noProof/>
+        </w:rPr>
+        <w:fldChar w:fldCharType="begin"/>
+      </w:r>
+      <w:r>
+        <w:rPr>
+          <w:noProof/>
+        </w:rPr>
+        <w:instrText xml:space="preserve"> PAGEREF _Toc235183243 \h </w:instrText>
+      </w:r>
+      <w:r>
+        <w:rPr>
+          <w:noProof/>
+        </w:rPr>
+      </w:r>
+      <w:r>
+        <w:rPr>
+          <w:noProof/>
+        </w:rPr>
+        <w:fldChar w:fldCharType="separate"/>
+      </w:r>
+      <w:r>
+        <w:rPr>
+          <w:noProof/>
+        </w:rPr>
+        <w:t>4</w:t>
+      </w:r>
+      <w:r>
+        <w:rPr>
+          <w:noProof/>
+        </w:rPr>
+        <w:fldChar w:fldCharType="end"/>
+      </w:r>
+    </w:p>
+    <w:p>
+      <w:pPr>
+        <w:pStyle w:val="TOC1"/>
+        <w:tabs>
+          <w:tab w:val="right" w:leader="dot" w:pos="9782"/>
+        </w:tabs>
+        <w:rPr>
+          <w:rFonts w:asciiTheme="minorHAnsi" w:hAnsiTheme="minorHAnsi"/>
+          <w:noProof/>
+          <w:kern w:val="2"/>
+          <w:sz w:val="24"/>
+          <w:szCs w:val="24"/>
+          <w14:ligatures w14:val="standardContextual"/>
+        </w:rPr>
+      </w:pPr>
+      <w:r>
+        <w:rPr>
+          <w:noProof/>
+        </w:rPr>
+        <w:t>Logging and LED Behavior</w:t>
+      </w:r>
+      <w:r>
+        <w:rPr>
+          <w:noProof/>
+        </w:rPr>
+        <w:tab/>
+      </w:r>
+      <w:r>
+        <w:rPr>
+          <w:noProof/>
+        </w:rPr>
+        <w:fldChar w:fldCharType="begin"/>
+      </w:r>
+      <w:r>
+        <w:rPr>
+          <w:noProof/>
+        </w:rPr>
+        <w:instrText xml:space="preserve"> PAGEREF _Toc235183244 \h </w:instrText>
+      </w:r>
+      <w:r>
+        <w:rPr>
+          <w:noProof/>
+        </w:rPr>
+      </w:r>
+      <w:r>
+        <w:rPr>
+          <w:noProof/>
+        </w:rPr>
+        <w:fldChar w:fldCharType="separate"/>
+      </w:r>
+      <w:r>
+        <w:rPr>
+          <w:noProof/>
+        </w:rPr>
+        <w:t>5</w:t>
+      </w:r>
+      <w:r>
+        <w:rPr>
+          <w:noProof/>
+        </w:rPr>
+        <w:fldChar w:fldCharType="end"/>
+      </w:r>
+    </w:p>
+    <w:p>
+      <w:pPr>
+        <w:pStyle w:val="TOC1"/>
+        <w:tabs>
+          <w:tab w:val="right" w:leader="dot" w:pos="9782"/>
+        </w:tabs>
+        <w:rPr>
+          <w:rFonts w:asciiTheme="minorHAnsi" w:hAnsiTheme="minorHAnsi"/>
+          <w:noProof/>
+          <w:kern w:val="2"/>
+          <w:sz w:val="24"/>
+          <w:szCs w:val="24"/>
+          <w14:ligatures w14:val="standardContextual"/>
+        </w:rPr>
+      </w:pPr>
+      <w:r>
+        <w:rPr>
+          <w:noProof/>
+        </w:rPr>
+        <w:t>Help Button Integration</w:t>
+      </w:r>
+      <w:r>
+        <w:rPr>
+          <w:noProof/>
+        </w:rPr>
+        <w:tab/>
+      </w:r>
+      <w:r>
+        <w:rPr>
+          <w:noProof/>
+        </w:rPr>
+        <w:fldChar w:fldCharType="begin"/>
+      </w:r>
+      <w:r>
+        <w:rPr>
+          <w:noProof/>
+        </w:rPr>
+        <w:instrText xml:space="preserve"> PAGEREF _Toc235183245 \h </w:instrText>
+      </w:r>
+      <w:r>
+        <w:rPr>
+          <w:noProof/>
+        </w:rPr>
+      </w:r>
+      <w:r>
+        <w:rPr>
+          <w:noProof/>
+        </w:rPr>
+        <w:fldChar w:fldCharType="separate"/>
+      </w:r>
+      <w:r>
+        <w:rPr>
+          <w:noProof/>
+        </w:rPr>
+        <w:t>5</w:t>
+      </w:r>
+      <w:r>
+        <w:rPr>
+          <w:noProof/>
+        </w:rPr>
+        <w:fldChar w:fldCharType="end"/>
+      </w:r>
+    </w:p>
+    <w:p>
+      <w:pPr>
+        <w:pStyle w:val="TOC1"/>
+        <w:tabs>
+          <w:tab w:val="right" w:leader="dot" w:pos="9782"/>
+        </w:tabs>
+        <w:rPr>
+          <w:rFonts w:asciiTheme="minorHAnsi" w:hAnsiTheme="minorHAnsi"/>
+          <w:noProof/>
+          <w:kern w:val="2"/>
+          <w:sz w:val="24"/>
+          <w:szCs w:val="24"/>
+          <w14:ligatures w14:val="standardContextual"/>
+        </w:rPr>
+      </w:pPr>
+      <w:r>
+        <w:rPr>
+          <w:noProof/>
+        </w:rPr>
+        <w:t>Known Maintenance Considerations</w:t>
+      </w:r>
+      <w:r>
+        <w:rPr>
+          <w:noProof/>
+        </w:rPr>
+        <w:tab/>
+      </w:r>
+      <w:r>
+        <w:rPr>
+          <w:noProof/>
+        </w:rPr>
+        <w:fldChar w:fldCharType="begin"/>
+      </w:r>
+      <w:r>
+        <w:rPr>
+          <w:noProof/>
+        </w:rPr>
+        <w:instrText xml:space="preserve"> PAGEREF _Toc235183246 \h </w:instrText>
+      </w:r>
+      <w:r>
+        <w:rPr>
+          <w:noProof/>
+        </w:rPr>
+      </w:r>
+      <w:r>
+        <w:rPr>
+          <w:noProof/>
+        </w:rPr>
+        <w:fldChar w:fldCharType="separate"/>
+      </w:r>
+      <w:r>
+        <w:rPr>
+          <w:noProof/>
+        </w:rPr>
+        <w:t>5</w:t>
+      </w:r>
+      <w:r>
+        <w:rPr>
+          <w:noProof/>
+        </w:rPr>
+        <w:fldChar w:fldCharType="end"/>
+      </w:r>
+    </w:p>
+    <w:p>
+      <w:pPr>
+        <w:pStyle w:val="TOC1"/>
+        <w:tabs>
+          <w:tab w:val="right" w:leader="dot" w:pos="9782"/>
+        </w:tabs>
+        <w:rPr>
+          <w:rFonts w:asciiTheme="minorHAnsi" w:hAnsiTheme="minorHAnsi"/>
+          <w:noProof/>
+          <w:kern w:val="2"/>
+          <w:sz w:val="24"/>
+          <w:szCs w:val="24"/>
+          <w14:ligatures w14:val="standardContextual"/>
+        </w:rPr>
+      </w:pPr>
+      <w:r>
+        <w:rPr>
+          <w:noProof/>
+        </w:rPr>
+        <w:t>Build and Release Notes</w:t>
+      </w:r>
+      <w:r>
+        <w:rPr>
+          <w:noProof/>
+        </w:rPr>
+        <w:tab/>
+      </w:r>
+      <w:r>
+        <w:rPr>
+          <w:noProof/>
+        </w:rPr>
+        <w:fldChar w:fldCharType="begin"/>
+      </w:r>
+      <w:r>
+        <w:rPr>
+          <w:noProof/>
+        </w:rPr>
+        <w:instrText xml:space="preserve"> PAGEREF _Toc235183247 \h </w:instrText>
+      </w:r>
+      <w:r>
+        <w:rPr>
+          <w:noProof/>
+        </w:rPr>
+      </w:r>
+      <w:r>
+        <w:rPr>
+          <w:noProof/>
+        </w:rPr>
+        <w:fldChar w:fldCharType="separate"/>
+      </w:r>
+      <w:r>
+        <w:rPr>
+          <w:noProof/>
+        </w:rPr>
+        <w:t>5</w:t>
+      </w:r>
+      <w:r>
+        <w:rPr>
+          <w:noProof/>
+        </w:rPr>
+        <w:fldChar w:fldCharType="end"/>
+      </w:r>
+    </w:p>
+    <w:p>
+      <w:pPr>
         <w:pStyle w:val="Heading1"/>
       </w:pPr>
       <w:r>
+        <w:fldChar w:fldCharType="end"/>
+      </w:r>
+    </w:p>
+    <w:p>
+      <w:pPr>
+        <w:pStyle w:val="Heading1"/>
+      </w:pPr>
+      <w:r>
+        <w:br w:type="page"/>
+      </w:r>
+      <w:bookmarkStart w:id="0" w:name="_Toc235183237"/>
+      <w:r>
+        <w:lastRenderedPageBreak/>
         <w:t>Scope</w:t>
       </w:r>
+      <w:bookmarkEnd w:id="0"/>
     </w:p>
     <w:p>
       <w:r>
@@ -57,9 +799,11 @@
       <w:pPr>
         <w:pStyle w:val="Heading1"/>
       </w:pPr>
+      <w:bookmarkStart w:id="1" w:name="_Toc235183238"/>
       <w:r>
         <w:t>Project Structure</w:t>
       </w:r>
+      <w:bookmarkEnd w:id="1"/>
     </w:p>
     <w:tbl>
       <w:tblPr>
@@ -353,9 +1097,11 @@
       <w:pPr>
         <w:pStyle w:val="Heading1"/>
       </w:pPr>
+      <w:bookmarkStart w:id="2" w:name="_Toc235183239"/>
       <w:r>
         <w:t>Runtime Startup</w:t>
       </w:r>
+      <w:bookmarkEnd w:id="2"/>
     </w:p>
     <w:p>
       <w:pPr>
@@ -434,10 +1180,11 @@
       <w:pPr>
         <w:pStyle w:val="Heading1"/>
       </w:pPr>
+      <w:bookmarkStart w:id="3" w:name="_Toc235183240"/>
       <w:r>
-        <w:lastRenderedPageBreak/>
         <w:t>Main Form Components</w:t>
       </w:r>
+      <w:bookmarkEnd w:id="3"/>
     </w:p>
     <w:tbl>
       <w:tblPr>
@@ -588,7 +1335,11 @@
               <w:spacing w:after="0"/>
             </w:pPr>
             <w:r>
-              <w:t>edtComPort, edtSyncInterval, edtDriftSeconds, rdoSetUTC, rdoSetLocal, and edtEnableLogging control runtime behavior.</w:t>
+              <w:t xml:space="preserve">edtComPort, edtSyncInterval, edtDriftSeconds, </w:t>
+            </w:r>
+            <w:r>
+              <w:lastRenderedPageBreak/>
+              <w:t>rdoSetUTC, rdoSetLocal, and edtEnableLogging control runtime behavior.</w:t>
             </w:r>
           </w:p>
         </w:tc>
@@ -607,6 +1358,7 @@
               <w:spacing w:after="0"/>
             </w:pPr>
             <w:r>
+              <w:lastRenderedPageBreak/>
               <w:t>Action buttons</w:t>
             </w:r>
           </w:p>
@@ -698,9 +1450,11 @@
       <w:pPr>
         <w:pStyle w:val="Heading1"/>
       </w:pPr>
+      <w:bookmarkStart w:id="4" w:name="_Toc235183241"/>
       <w:r>
         <w:t>Serial Port and VK-172 Detection</w:t>
       </w:r>
+      <w:bookmarkEnd w:id="4"/>
     </w:p>
     <w:p>
       <w:r>
@@ -933,9 +1687,11 @@
       <w:pPr>
         <w:pStyle w:val="Heading1"/>
       </w:pPr>
+      <w:bookmarkStart w:id="5" w:name="_Toc235183242"/>
       <w:r>
         <w:t>NMEA Processing</w:t>
       </w:r>
+      <w:bookmarkEnd w:id="5"/>
     </w:p>
     <w:p>
       <w:r>
@@ -1025,11 +1781,7 @@
               <w:spacing w:after="0"/>
             </w:pPr>
             <w:r>
-              <w:t xml:space="preserve">UTC date/time, valid/invalid status, latitude, and </w:t>
-            </w:r>
-            <w:r>
-              <w:lastRenderedPageBreak/>
-              <w:t>longitude.</w:t>
+              <w:t>UTC date/time, valid/invalid status, latitude, and longitude.</w:t>
             </w:r>
           </w:p>
         </w:tc>
@@ -1048,7 +1800,6 @@
               <w:spacing w:after="0"/>
             </w:pPr>
             <w:r>
-              <w:lastRenderedPageBreak/>
               <w:t>GGA</w:t>
             </w:r>
           </w:p>
@@ -1107,9 +1858,11 @@
       <w:pPr>
         <w:pStyle w:val="Heading1"/>
       </w:pPr>
+      <w:bookmarkStart w:id="6" w:name="_Toc235183243"/>
       <w:r>
         <w:t>Clock Synchronization</w:t>
       </w:r>
+      <w:bookmarkEnd w:id="6"/>
     </w:p>
     <w:p>
       <w:r>
@@ -1185,6 +1938,7 @@
               <w:spacing w:after="0"/>
             </w:pPr>
             <w:r>
+              <w:lastRenderedPageBreak/>
               <w:t>Set Local</w:t>
             </w:r>
           </w:p>
@@ -1276,9 +2030,11 @@
       <w:pPr>
         <w:pStyle w:val="Heading1"/>
       </w:pPr>
+      <w:bookmarkStart w:id="7" w:name="_Toc235183244"/>
       <w:r>
         <w:t>Logging and LED Behavior</w:t>
       </w:r>
+      <w:bookmarkEnd w:id="7"/>
     </w:p>
     <w:p>
       <w:pPr>
@@ -1329,9 +2085,11 @@
       <w:pPr>
         <w:pStyle w:val="Heading1"/>
       </w:pPr>
+      <w:bookmarkStart w:id="8" w:name="_Toc235183245"/>
       <w:r>
         <w:t>Help Button Integration</w:t>
       </w:r>
+      <w:bookmarkEnd w:id="8"/>
     </w:p>
     <w:p>
       <w:r>
@@ -1342,9 +2100,11 @@
       <w:pPr>
         <w:pStyle w:val="Heading1"/>
       </w:pPr>
+      <w:bookmarkStart w:id="9" w:name="_Toc235183246"/>
       <w:r>
         <w:t>Known Maintenance Considerations</w:t>
       </w:r>
+      <w:bookmarkEnd w:id="9"/>
     </w:p>
     <w:tbl>
       <w:tblPr>
@@ -1605,9 +2365,11 @@
       <w:pPr>
         <w:pStyle w:val="Heading1"/>
       </w:pPr>
+      <w:bookmarkStart w:id="10" w:name="_Toc235183247"/>
       <w:r>
         <w:t>Build and Release Notes</w:t>
       </w:r>
+      <w:bookmarkEnd w:id="10"/>
     </w:p>
     <w:p>
       <w:pPr>
@@ -1633,6 +2395,7 @@
         <w:spacing w:after="60"/>
       </w:pPr>
       <w:r>
+        <w:lastRenderedPageBreak/>
         <w:t>Website source: source\index.html and source\download.html.</w:t>
       </w:r>
     </w:p>
@@ -13334,6 +14097,18 @@
       </w:tcPr>
     </w:tblStylePr>
   </w:style>
+  <w:style w:type="paragraph" w:styleId="TOC1">
+    <w:name w:val="toc 1"/>
+    <w:basedOn w:val="Normal"/>
+    <w:next w:val="Normal"/>
+    <w:autoRedefine/>
+    <w:uiPriority w:val="39"/>
+    <w:unhideWhenUsed/>
+    <w:rsid w:val="00536C74"/>
+    <w:pPr>
+      <w:spacing w:after="100"/>
+    </w:pPr>
+  </w:style>
 </w:styles>
 </file>
 

</xml_diff>